<commit_message>
Update prototypes and evaluation tools; exclude local sample and environment files
</commit_message>
<xml_diff>
--- a/prototypes/Daeseong Ray Yang/firmengine-proto/templates/D5100.docx
+++ b/prototypes/Daeseong Ray Yang/firmengine-proto/templates/D5100.docx
@@ -545,6 +545,16 @@
       </w:r>
     </w:p>
     <w:p>
+      <w:r>
+        <w:t>□ 신청인은 별지 개인회생채권자목록 기재와 같은 채무를 부담하고 있으나, 수입 및 재산이 별지 수입 및 지출에 관한 목록과 재산목록에 기재된 바와 같으므로, 파산의 원인사실이 발생하였습니다(파산의 원인사실이 생길 염려가 있습니다).</w:t>
+      </w:r>
+    </w:p>
+    <w:p>
+      <w:r>
+        <w:t>□ 신청인은 부동산임대소득·사업소득·농업소득·임업소득 그 밖에 이와 유사한 수입을 장래에 계속적으로 또는 반복하여 얻을 것으로 예상되고, 또한 채무자 회생 및 파산에 관한 법률 제595조에 해당하는 개시신청 기각사유는 없습니다(영업소득자의 경우).</w:t>
+      </w:r>
+    </w:p>
+    <w:p>
       <w:pPr>
         <w:pStyle w:val="Heading1"/>
       </w:pPr>
@@ -721,6 +731,16 @@
       </w:tr>
     </w:tbl>
     <w:p/>
+    <w:p>
+      <w:r>
+        <w:t>신청인은 각 회생채권자에 대한 채무 전액의 변제가 곤란하므로, 그 일부를 분할하여 지급할 계획입니다. 현시점에서 계획하고 있는 변제예정액은 {{repayment_months}}개월간 월 {{monthly_payment}}원씩입니다. 개시결정이 내려지는 경우 {{repayment_start_date}}을 제1회로 하여, 이후 매월 {{repayment_day}}일에 개시결정 시 통지되는 개인회생위원의 은행계좌에 입금하는 내용으로 검토합니다.</w:t>
+      </w:r>
+    </w:p>
+    <w:p>
+      <w:r>
+        <w:t>이 사건 개인회생절차에서 적립금을 반환받을 신청인의 예금계좌는 {{refund_bank}} {{refund_account}}입니다. 계좌가 변경되거나 사용할 수 없게 된 경우 사건담당 회생위원에게 통장사본을 첨부하여 신고하는 내용을 확인합니다.</w:t>
+      </w:r>
+    </w:p>
     <w:p>
       <w:pPr>
         <w:pStyle w:val="Heading1"/>

</xml_diff>